<commit_message>
Integra in Finestre sul mare le firme lette, e adatta l'A5 ai testi lunghi
Milani, Hervall e Luigi Strino entrano nel testo come firme e nome sul
certificato; le ipotesi non verificate restano nelle note. La presentazione
riduce il corpo quanto basta perché l'inglese non sbordi sul piede.

Co-Authored-By: Claude Opus 5.5 <noreply@anthropic.com>
Claude-Session: https://claude.ai/code/session_0148bZgqQiCtdshijf84M1Qp
</commit_message>
<xml_diff>
--- a/testi-critici/artisti/collezione-privata-mare/word/presentazione.docx
+++ b/testi-critici/artisti/collezione-privata-mare/word/presentazione.docx
@@ -89,7 +89,7 @@
           <w:color w:val="1E1B18"/>
           <w:sz w:val="24"/>
         </w:rPr>
-        <w:t>Un golfo nella luce della sera, una baia con le vele, un porticciolo di barche ormeggiate, un veliero in mare aperto: quattro dipinti dalla stessa collezione privata, quattro modi di tenere il mare dentro casa. Le firme, quando si leggono, rimandano a nomi difficili da rintracciare; i certificati sul retro, con i prezzi in lire, raccontano piuttosto un’epoca, quella dei quadri a olio comprati per arredare fra gli anni Settanta e Novanta. Il mestiere è sicuro: spatola per le onde, tocchi bianchi per la schiuma e le vele, la luce chiara del Mediterraneo. Appesi in una stanza, erano finestre su un orizzonte lontano. Qui raccontano il mare come luogo dell’anima: la partenza sognata, il ritorno al porto.</w:t>
+        <w:t>Un golfo nella luce della sera, una baia con le vele, un porticciolo di barche ormeggiate, un veliero in mare aperto: quattro dipinti dalla stessa collezione privata, quattro modi di tenere il mare dentro casa. Le firme raccontano un’epoca più che una biografia: Milani sul golfo, Hervall sul veliero, Luigi Strino sul certificato del porto. Sono nomi del mercato d’arredo fra gli anni Settanta e Novanta, a volte nomi d’arte, quando i quadri a olio si compravano con il certificato e il prezzo in lire. Il mestiere è sicuro: spatola per le onde, tocchi bianchi per schiuma e vele. Appesi in una stanza, erano finestre su un orizzonte lontano. Qui raccontano il mare come luogo dell’anima: la partenza sognata, il ritorno al porto.</w:t>
       </w:r>
     </w:p>
     <w:p>
@@ -105,7 +105,7 @@
           <w:color w:val="6B645B"/>
           <w:sz w:val="21"/>
         </w:rPr>
-        <w:t>A gulf in the evening light, a bay with sails, a small harbour of moored boats, a tall ship on the open sea: four paintings from the same private collection, four ways of keeping the sea at home. The signatures, where legible, point to names that are hard to trace; the certificates on the back, priced in lire, tell instead of an era, that of oil paintings bought to furnish a home between the 1970s and the 1990s. The craft is assured: palette knife for the waves, white touches for foam and sails, the clear light of the Mediterranean. Hung in a room, they were windows onto a distant horizon. Here they tell of the sea as a place of the soul: the departure dreamed of, the return to harbour.</w:t>
+        <w:t>A gulf in the evening light, a bay with sails, a small harbour of moored boats, a tall ship on the open sea: four paintings from the same private collection, four ways of keeping the sea at home. The signatures tell of an era more than a biography: Milani on the gulf, Hervall on the tall ship, Luigi Strino on the harbour’s certificate. These are names from the decorative market of the 1970s to the 1990s, sometimes pseudonyms, when oil paintings were bought with a certificate and a price in lire. The craft is assured: palette knife for the waves, white touches for foam and sails. Hung in a room, they were windows onto a distant horizon. Here they tell of the sea as a place of the soul: the departure dreamed of, the return to harbour.</w:t>
       </w:r>
     </w:p>
     <w:sectPr>

</xml_diff>